<commit_message>
Docs and manual V0.4: pairing v2 code check
SECURE_LINK checklist and transition decision, MANUAL_PAIRING current
flow, INTENT_MODEL PairConfirm binding, and the manual's pairing steps
(code check, Atlas's red light, one-minute limit, pair again for the
secure link).

Co-Authored-By: Claude Opus 5.5 <noreply@anthropic.com>
</commit_message>
<xml_diff>
--- a/Documentation/User Manual/TurnHub Manual V0.4.docx
+++ b/Documentation/User Manual/TurnHub Manual V0.4.docx
@@ -1267,6 +1267,9 @@
       <w:r>
         <w:t>, then Pair a Sigil, on the Atlas screen. Atlas returns to the lobby screen, opens a pairing window, normally 15 seconds, and counts it down. An administrator can lengthen it to 30 or 60 seconds under Device Settings.</w:t>
       </w:r>
+      <w:r>
+        <w:t xml:space="preserve"> Atlas’s small light blinks red while the window is open.</w:t>
+      </w:r>
     </w:p>
     <w:p>
       <w:pPr>
@@ -1295,7 +1298,22 @@
         </w:rPr>
       </w:pPr>
       <w:r>
-        <w:t xml:space="preserve">Wait until the Sigil shows its number.</w:t>
+        <w:t xml:space="preserve">The Sigil and the Atlas screen each show the same 4-digit code. If they match, tap Codes match on Atlas (or, as an administrator verified at the table, in Device Settings in the browser). If they differ, tap Reject: something else answered the Sigil. After Codes match the Sigil shows its number.</w:t>
+      </w:r>
+    </w:p>
+    <w:p>
+      <w:pPr>
+        <w:numPr>
+          <w:ilvl w:val="0"/>
+          <w:numId w:val="200"/>
+        </w:numPr>
+        <w:spacing w:before="100" w:beforeAutospacing="1" w:after="100" w:afterAutospacing="1" w:line="240" w:lineRule="auto"/>
+        <w:rPr>
+          <w:rFonts w:eastAsia="Times New Roman"/>
+        </w:rPr>
+      </w:pPr>
+      <w:r>
+        <w:t xml:space="preserve">If nobody answers within a minute, nothing is saved: pair again. A Sigil paired with older firmware is marked “pair again for the secure link” in Device Settings; pair it again the same way.</w:t>
       </w:r>
     </w:p>
     <w:p>

</xml_diff>

<commit_message>
Pairing windows: 60 s minimum on every device
PAIRING_WINDOW_MS goes from 15 s to 60 s (the Sigil's window and
Atlas's default); Atlas's admin choices become 60, 90 or 120 s, never
shorter, and a saved 15 or 30 s reads as 60 s. The harness waits long
enough for the window plus two code checks. UI text, Wokwi, docs,
CLAUDE.md and manual V0.4 updated.

Co-Authored-By: Claude Opus 5.5 <noreply@anthropic.com>
</commit_message>
<xml_diff>
--- a/Documentation/User Manual/TurnHub Manual V0.4.docx
+++ b/Documentation/User Manual/TurnHub Manual V0.4.docx
@@ -1265,7 +1265,7 @@
         <w:t>Menu</w:t>
       </w:r>
       <w:r>
-        <w:t>, then Pair a Sigil, on the Atlas screen. Atlas returns to the lobby screen, opens a pairing window, normally 15 seconds, and counts it down. An administrator can lengthen it to 30 or 60 seconds under Device Settings.</w:t>
+        <w:t>, then Pair a Sigil, on the Atlas screen. Atlas returns to the lobby screen, opens a pairing window of 60 seconds and counts it down. An administrator can lengthen it to 90 or 120 seconds under Device Settings.</w:t>
       </w:r>
       <w:r>
         <w:t xml:space="preserve"> Atlas’s small light blinks red while the window is open.</w:t>
@@ -1283,7 +1283,7 @@
         </w:rPr>
       </w:pPr>
       <w:r>
-        <w:t>Within that time, press the Pair (BOOT) button on the Sigil. Its light ring blinks while it looks for Atlas. The Sigil’s own window is always 15 seconds, so with a longer Atlas window tap Pair a Sigil on Atlas first, then press the Sigil’s button.</w:t>
+        <w:t>Within that time, press the Pair (BOOT) button on the Sigil. Its light ring blinks while it looks for Atlas. The Sigil’s own window is always 60 seconds, so with a longer Atlas window tap Pair a Sigil on Atlas first, then press the Sigil’s button.</w:t>
       </w:r>
     </w:p>
     <w:p>

</xml_diff>